<commit_message>
Update resume docx files
Co-Authored-By: Claude Sonnet 5 <noreply@anthropic.com>
</commit_message>
<xml_diff>
--- a/Resume/Olalekan_Ogundare_Resume_IaC.docx
+++ b/Resume/Olalekan_Ogundare_Resume_IaC.docx
@@ -616,16 +616,6 @@
       </w:pPr>
       <w:r>
         <w:lastRenderedPageBreak/>
-        <w:t>Led AWS and Azure platform engineering for client engagements — building reusable landing zone patterns, self-service infrastructure modules, and golden-path Terraform/ARM templates that client engineering teams adopted directly instead of provisioning environments by hand.</w:t>
-      </w:r>
-    </w:p>
-    <w:p>
-      <w:pPr>
-        <w:pStyle w:val="ListBullet"/>
-        <w:spacing w:after="20"/>
-        <w:ind w:left="317"/>
-      </w:pPr>
-      <w:r>
         <w:t>Built and operated cloud compute, storage, and serverless platforms across Azure (Virtual Machines, VM Scale Sets, Azure Batch, Storage Accounts, Azure Functions, App Services, Container Apps) and AWS (EC2, S3, Lambda, EBS, Fargate, ECS) for client workloads.</w:t>
       </w:r>
     </w:p>
@@ -673,26 +663,6 @@
       </w:pPr>
       <w:r>
         <w:t>Implemented cloud security controls across both platforms — Azure RBAC/NSGs/Key Vault/Defender for Cloud/Azure Policy, and AWS IAM/SCPs/Security Groups/KMS/GuardDuty/Security Hub — for continuous posture monitoring and encryption at rest/in transit.</w:t>
-      </w:r>
-    </w:p>
-    <w:p>
-      <w:pPr>
-        <w:pStyle w:val="ListBullet"/>
-        <w:spacing w:after="20"/>
-        <w:ind w:left="317"/>
-      </w:pPr>
-      <w:r>
-        <w:t>Designed backup, disaster recovery, and resilience strategies using Azure Backup and Azure Site Recovery (cross-region failover, RTO/RPO-driven recovery tiers) alongside AWS Backup and cross-region replication, validated through regular recovery drills rather than assuming failover would work untested.</w:t>
-      </w:r>
-    </w:p>
-    <w:p>
-      <w:pPr>
-        <w:pStyle w:val="ListBullet"/>
-        <w:spacing w:after="20"/>
-        <w:ind w:left="317"/>
-      </w:pPr>
-      <w:r>
-        <w:t>Architected and operated AWS database services for client workloads — Aurora (PostgreSQL/MySQL-compatible) and RDS for relational workloads, DynamoDB for high-throughput key-value access patterns, DocumentDB for MongoDB-compatible document workloads, and ElastiCache for low-latency caching in front of primary datastores.</w:t>
       </w:r>
     </w:p>
     <w:p>
@@ -862,6 +832,7 @@
         <w:ind w:left="317"/>
       </w:pPr>
       <w:r>
+        <w:lastRenderedPageBreak/>
         <w:t>Built and hardened golden AMIs (RHEL, Amazon Linux 2023) via EC2 Image Builder, integrating CrowdStrike Falcon, Qualys, and Tanium for endpoint protection, CVE remediation, and compliance validation; administered Qualys patch management (agents, asset groups, deployment jobs, post-patch compliance reporting).</w:t>
       </w:r>
     </w:p>
@@ -884,7 +855,6 @@
           <w:b/>
           <w:color w:val="333333"/>
         </w:rPr>
-        <w:lastRenderedPageBreak/>
         <w:t>Observability &amp; Reliability</w:t>
       </w:r>
     </w:p>
@@ -1189,6 +1159,7 @@
         <w:ind w:left="317"/>
       </w:pPr>
       <w:r>
+        <w:lastRenderedPageBreak/>
         <w:t>Architected and scaled hybrid/multi-cloud AWS infrastructure (VPC, EC2, ELB, RDS, Transit Gateway) across multiple regions.</w:t>
       </w:r>
     </w:p>
@@ -1209,7 +1180,6 @@
         <w:ind w:left="317"/>
       </w:pPr>
       <w:r>
-        <w:lastRenderedPageBreak/>
         <w:t>Developed Service Control Policies enforcing encryption, region restrictions, and public-access blocks; implemented preventive and detective Control Tower guardrails for continuous compliance.</w:t>
       </w:r>
     </w:p>
@@ -1700,17 +1670,7 @@
         <w:ind w:left="317"/>
       </w:pPr>
       <w:r>
-        <w:t>Recognized for $1.2M in infrastructure savings via hybrid/multi-cloud modernization (Texas A&amp;M engagement).</w:t>
-      </w:r>
-    </w:p>
-    <w:p>
-      <w:pPr>
-        <w:pStyle w:val="ListBullet"/>
-        <w:spacing w:after="20"/>
-        <w:ind w:left="317"/>
-      </w:pPr>
-      <w:r>
-        <w:t>Honored for achieving 99.99% uptime and excellence in multi-region cloud reliability.</w:t>
+        <w:t>Recognized for $1.2M in infrastructure savings via hybrid/multi-cloud modernization (Texas A&amp;M engagement)</w:t>
       </w:r>
     </w:p>
     <w:sectPr>

</xml_diff>